<commit_message>
Add/update resource data for AquiferOpenBibleDictionary
</commit_message>
<xml_diff>
--- a/apd/docx/001.content.docx
+++ b/apd/docx/001.content.docx
@@ -178,13 +178,6 @@
         <w:rPr>
           <w:lang w:val="ar_AE" w:bidi="ar_AE"/>
         </w:rPr>
-      </w:r>
-      <w:r>
-        <w:rPr>
-          <w:i/>
-          <w:lang w:val="ar_AE" w:bidi="ar_AE"/>
-        </w:rPr>
-        <w:t>الإنجيل، البشارة</w:t>
       </w:r>
       <w:r>
         <w:rPr>

</xml_diff>

<commit_message>
Update AquiferOpenBibleDictionary data for 2026-07-14 release
</commit_message>
<xml_diff>
--- a/apd/docx/001.content.docx
+++ b/apd/docx/001.content.docx
@@ -22,7 +22,7 @@
         <w:rPr>
           <w:lang w:val="ar_AE" w:bidi="ar_AE"/>
         </w:rPr>
-        <w:t>Resource: Tyndale Open Bible Dictionary</w:t>
+        <w:t>Resource: Aquifer Open Bible Dictionary</w:t>
       </w:r>
       <w:r>
         <w:rPr>
@@ -122,7 +122,7 @@
         <w:rPr>
           <w:lang w:val="ar_AE" w:bidi="ar_AE"/>
         </w:rPr>
-        <w:t>Tyndale Open Bible Dictionary</w:t>
+        <w:t>Aquifer Open Bible Dictionary</w:t>
       </w:r>
     </w:p>
     <w:p>

</xml_diff>